<commit_message>
Almindeligt dansk: rettelser efter uafhængig kontrol
Tre uafhængige gennemlæsninger fandt ét alvorligt fund (årstallet 2019
var faldet ud i del 1, O.2) og en række mindre: for snæver forklaring af
regnefejlen, 'sortere' i stedet for 'filtrere', tabte præciseringer,
uforklarede fagord (edge, slippage, rollover, standardfejl, fyldregler
m.fl.) og noter til korrekturlæseren. Alle er rettet; kodeblokke er
stadig ordret som i originalen.

Co-Authored-By: Claude Opus 5.5 <noreply@anthropic.com>
Claude-Session: https://claude.ai/code/session_019x7uopeMe9HxxQE5JguQ58
</commit_message>
<xml_diff>
--- a/Konsulentopgaver/Pharos_udkast_almdansk_2026-09-29.docx
+++ b/Konsulentopgaver/Pharos_udkast_almdansk_2026-09-29.docx
@@ -175,6 +175,106 @@
     </w:p>
     <w:p>
       <w:pPr>
+        <w:pStyle w:val="ListParagraph"/>
+        <w:numPr>
+          <w:ilvl w:val="0"/>
+          <w:numId w:val="2"/>
+        </w:numPr>
+        <w:spacing w:after="40"/>
+      </w:pPr>
+      <w:r>
+        <w:rPr>
+          <w:b/>
+          <w:bCs/>
+        </w:rPr>
+        <w:t xml:space="preserve">Edge</w:t>
+      </w:r>
+      <w:r>
+        <w:t xml:space="preserve">: en ægte, gentagelig fordel i markedet — det modsatte af held. En "død edge" er en fordel, der er holdt op med at virke.</w:t>
+      </w:r>
+    </w:p>
+    <w:p>
+      <w:pPr>
+        <w:pStyle w:val="ListParagraph"/>
+        <w:numPr>
+          <w:ilvl w:val="0"/>
+          <w:numId w:val="2"/>
+        </w:numPr>
+        <w:spacing w:after="40"/>
+      </w:pPr>
+      <w:r>
+        <w:rPr>
+          <w:b/>
+          <w:bCs/>
+        </w:rPr>
+        <w:t xml:space="preserve">Slippage</w:t>
+      </w:r>
+      <w:r>
+        <w:t xml:space="preserve">: forskellen mellem den pris, man regnede med at handle til, og den pris, man faktisk fik.</w:t>
+      </w:r>
+    </w:p>
+    <w:p>
+      <w:pPr>
+        <w:pStyle w:val="ListParagraph"/>
+        <w:numPr>
+          <w:ilvl w:val="0"/>
+          <w:numId w:val="2"/>
+        </w:numPr>
+        <w:spacing w:after="40"/>
+      </w:pPr>
+      <w:r>
+        <w:rPr>
+          <w:b/>
+          <w:bCs/>
+        </w:rPr>
+        <w:t xml:space="preserve">Backtest</w:t>
+      </w:r>
+      <w:r>
+        <w:t xml:space="preserve">: at regne en strategi igennem på gamle priser, som om den havde handlet dengang.</w:t>
+      </w:r>
+    </w:p>
+    <w:p>
+      <w:pPr>
+        <w:pStyle w:val="ListParagraph"/>
+        <w:numPr>
+          <w:ilvl w:val="0"/>
+          <w:numId w:val="2"/>
+        </w:numPr>
+        <w:spacing w:after="40"/>
+      </w:pPr>
+      <w:r>
+        <w:rPr>
+          <w:b/>
+          <w:bCs/>
+        </w:rPr>
+        <w:t xml:space="preserve">Walk-forward</w:t>
+      </w:r>
+      <w:r>
+        <w:t xml:space="preserve">: en test, hvor en regel vælges på én periode og afprøves på den næste, hvorefter man rykker frem og gentager.</w:t>
+      </w:r>
+    </w:p>
+    <w:p>
+      <w:pPr>
+        <w:pStyle w:val="ListParagraph"/>
+        <w:numPr>
+          <w:ilvl w:val="0"/>
+          <w:numId w:val="2"/>
+        </w:numPr>
+        <w:spacing w:after="40"/>
+      </w:pPr>
+      <w:r>
+        <w:rPr>
+          <w:b/>
+          <w:bCs/>
+        </w:rPr>
+        <w:t xml:space="preserve">Lokkeduer</w:t>
+      </w:r>
+      <w:r>
+        <w:t xml:space="preserve">: falske udgaver af data (fx med månederne blandet), som viser, hvor gode resultater ren tilfældighed kan give.</w:t>
+      </w:r>
+    </w:p>
+    <w:p>
+      <w:pPr>
         <w:spacing w:after="100"/>
       </w:pPr>
       <w:r>
@@ -225,7 +325,7 @@
         <w:t xml:space="preserve">Sådan dømmer Pharos</w:t>
       </w:r>
       <w:r>
-        <w:t xml:space="preserve"> (afsnit 4): Hver strategi måles mod det, den lovede ved frys 2, ikke mod sidste måned. En dårlig, men normal periode giver ingen handling. Er strategien meget dårligere end lovet, foreslår Pharos pause. Er den ekstremt dårligere, pensioneres den (ca. 1,3 % af gode strategier rammes af uheld på 5 år, konsulent 1's laboratorium). I andre tilfælde foreslår Pharos pension, og du beslutter. Pensioneret er endeligt.</w:t>
+        <w:t xml:space="preserve"> (afsnit 4): Hver strategi måles mod det, den lovede ved frys 2, ikke mod sidste måned. En dårlig, men normal periode giver ingen handling. Er strategien meget dårligere end lovet, foreslår Pharos pause. Er den ekstremt dårligere, pensioneres den (ca. 1,3 % af gode strategier rammes af uheld på 5 år, konsulent 1's laboratorium). Har en strategi været længe eller gentagne gange på pause, foreslår Pharos pension, og du beslutter. Pensioneret er endeligt.</w:t>
       </w:r>
     </w:p>
     <w:p>
@@ -1032,7 +1132,7 @@
           <w:b/>
           <w:bCs/>
         </w:rPr>
-        <w:t xml:space="preserve">Uden sammenhæng mellem strategiernes resultater fra periode til periode:</w:t>
+        <w:t xml:space="preserve">Når en strategis gode og dårlige perioder ikke varer ved (en god måned siger intet om den næste):</w:t>
       </w:r>
       <w:r>
         <w:t xml:space="preserve"> Den Titan-lignende regel gav samme gennemsnit som "alle med samme risiko". Men forholdet mellem gevinst og udsving faldt fra 3,3 til 1,9, og den største nedtur blev ca. 3 gange så stor. Grunden er, at reglen handlede færre strategier ad gangen.</w:t>
@@ -1111,9 +1211,6 @@
           <w:bCs/>
         </w:rPr>
         <w:t xml:space="preserve">Hvor Pharos sidder i kæden</w:t>
-      </w:r>
-      <w:r>
-        <w:t xml:space="preserve"> (skitsen er gengivet uændret)</w:t>
       </w:r>
     </w:p>
     <w:p>
@@ -5025,7 +5122,7 @@
         <w:t xml:space="preserve">Hukommelse:</w:t>
       </w:r>
       <w:r>
-        <w:t xml:space="preserve"> sammenhængen mellem en strategis afvigelse fra forventningen i måned m og m+1, med sikkerhedsinterval fra blok-bootstrap (gentagen omtrækning af blokke af data) [6.1, punkt 4].</w:t>
+        <w:t xml:space="preserve"> sammenhængen mellem en strategis afvigelse fra forventningen i måned m og m+1, med sikkerhedsinterval fra blok-bootstrap (man trækker tilfældigt hele sammenhængende stykker af resultaterne, fx nogle måneder ad gangen, og sætter dem sammen til mange nye udgaver af historien; spredningen mellem udgaverne viser, hvor usikkert tallet er) [6.1, punkt 4].</w:t>
       </w:r>
     </w:p>
     <w:p>

</xml_diff>